<commit_message>
Didática em todo o módulo causal + roteiros de demonstração no banco
Todas as aulas do M2 (causal) ganham definição em palavras simples e analogia
do dia a dia (GPS, endereço inexistente, conferir notícia). Banco atualizado:
mapa/ficha na nova ordem dos módulos + Apêndice E (roteiros de Triagem e Modelos/lote).

Co-Authored-By: Claude Opus 4.8 (1M context) <noreply@anthropic.com>
</commit_message>
<xml_diff>
--- a/Banco-de-Prompts-Servidor-IA.docx
+++ b/Banco-de-Prompts-Servidor-IA.docx
@@ -658,13 +658,13 @@
           <w:b/>
           <w:color w:val="222833"/>
         </w:rPr>
-        <w:t xml:space="preserve">Módulo 2 — Prática forense e administrativa (10h): </w:t>
+        <w:t xml:space="preserve">Módulo 2 — Pensamento crítico e causal (6h): </w:t>
       </w:r>
       <w:r>
         <w:rPr>
           <w:color w:val="444B55"/>
         </w:rPr>
-        <w:t>Redigir, comparar, extrair, classificar, sintetizar normativa, planejar (M3, M5, M6, M9, M13, M8) + Apêndice A.</w:t>
+        <w:t>Analisar criticamente, separar correlação de causalidade, gerar roteiros e brainstorm (M11, M10, M12) + Apêndice B.</w:t>
       </w:r>
     </w:p>
     <w:p>
@@ -676,13 +676,13 @@
           <w:b/>
           <w:color w:val="222833"/>
         </w:rPr>
-        <w:t xml:space="preserve">Módulo 3 — Pensamento crítico e causal (6h): </w:t>
+        <w:t xml:space="preserve">Módulo 3 — Prática forense (10h): </w:t>
       </w:r>
       <w:r>
         <w:rPr>
           <w:color w:val="444B55"/>
         </w:rPr>
-        <w:t>Analisar criticamente, separar correlação de causalidade, gerar roteiros e brainstorm (M11, M10, M12) + Apêndice B.</w:t>
+        <w:t>Redigir, comparar, extrair, classificar, sintetizar normativa, planejar (M3, M5, M6, M9, M13, M8) + Apêndice A.</w:t>
       </w:r>
     </w:p>
     <w:p>
@@ -5259,6 +5259,524 @@
           <w:color w:val="444B55"/>
         </w:rPr>
         <w:t>Se a minuta contiver dados sigilosos, a revisão respeitou as regras de sigilo da Seção 3.</w:t>
+      </w:r>
+    </w:p>
+    <w:p>
+      <w:r>
+        <w:br w:type="page"/>
+      </w:r>
+    </w:p>
+    <w:p>
+      <w:pPr>
+        <w:spacing w:before="320" w:after="80"/>
+        <w:pBdr>
+          <w:bottom w:val="single" w:sz="18" w:space="4" w:color="C85A1B"/>
+        </w:pBdr>
+      </w:pPr>
+      <w:r>
+        <w:rPr>
+          <w:b/>
+          <w:color w:val="C85A1B"/>
+          <w:sz w:val="40"/>
+        </w:rPr>
+        <w:t xml:space="preserve">E  </w:t>
+      </w:r>
+      <w:r>
+        <w:rPr>
+          <w:b/>
+          <w:color w:val="222833"/>
+          <w:sz w:val="40"/>
+        </w:rPr>
+        <w:t>Roteiros de demonstração em aula</w:t>
+      </w:r>
+    </w:p>
+    <w:p>
+      <w:r>
+        <w:rPr>
+          <w:i w:val="0"/>
+          <w:color w:val="444B55"/>
+          <w:sz w:val="22"/>
+        </w:rPr>
+        <w:t>Dois roteiros prontos para o instrutor mostrar ao vivo, no chat, tarefas que parecem exigir um sistema mas se resolvem com um único prompt. Use sempre dados fictícios ou anonimizados.</w:t>
+      </w:r>
+    </w:p>
+    <w:p>
+      <w:pPr>
+        <w:spacing w:before="240" w:after="40"/>
+      </w:pPr>
+      <w:r>
+        <w:rPr>
+          <w:b/>
+          <w:color w:val="222833"/>
+          <w:sz w:val="28"/>
+        </w:rPr>
+        <w:t>E1 · Triagem e classificação</w:t>
+      </w:r>
+    </w:p>
+    <w:p>
+      <w:r>
+        <w:rPr>
+          <w:i/>
+          <w:color w:val="6B7280"/>
+          <w:sz w:val="21"/>
+        </w:rPr>
+        <w:t>Objetivo: triar um lote de demandas em segundos e ver as urgências saltarem. (Módulo 3, aula de Triagem.)</w:t>
+      </w:r>
+    </w:p>
+    <w:p>
+      <w:pPr>
+        <w:spacing w:before="160" w:after="40"/>
+      </w:pPr>
+      <w:r>
+        <w:rPr>
+          <w:b/>
+          <w:color w:val="C85A1B"/>
+          <w:sz w:val="23"/>
+        </w:rPr>
+        <w:t>Cole na ferramenta de IA</w:t>
+      </w:r>
+    </w:p>
+    <w:p>
+      <w:pPr>
+        <w:spacing w:before="80" w:after="160" w:line="278" w:lineRule="auto"/>
+        <w:shd w:val="clear" w:fill="F4F1EC"/>
+        <w:pBdr>
+          <w:top w:val="single" w:sz="6" w:space="8" w:color="D9CFC0"/>
+          <w:left w:val="single" w:sz="6" w:space="8" w:color="D9CFC0"/>
+          <w:bottom w:val="single" w:sz="6" w:space="8" w:color="D9CFC0"/>
+          <w:right w:val="single" w:sz="6" w:space="8" w:color="D9CFC0"/>
+        </w:pBdr>
+      </w:pPr>
+      <w:r>
+        <w:rPr>
+          <w:rFonts w:ascii="Consolas" w:hAnsi="Consolas"/>
+          <w:color w:val="332A22"/>
+          <w:sz w:val="19"/>
+        </w:rPr>
+        <w:t>Você é um analista da [unidade] da Justiça Federal no Ceará.</w:t>
+        <w:br/>
+      </w:r>
+      <w:r>
+        <w:rPr>
+          <w:rFonts w:ascii="Consolas" w:hAnsi="Consolas"/>
+          <w:color w:val="332A22"/>
+          <w:sz w:val="19"/>
+        </w:rPr>
+        <w:t>Classifique cada item por matéria, urgência (alta/média/baixa) e providência sugerida.</w:t>
+        <w:br/>
+      </w:r>
+      <w:r>
+        <w:rPr>
+          <w:rFonts w:ascii="Consolas" w:hAnsi="Consolas"/>
+          <w:color w:val="332A22"/>
+          <w:sz w:val="19"/>
+        </w:rPr>
+        <w:t>Justifique em uma linha. Em caso de dúvida entre categorias, marque "revisar". Apresente em tabela.</w:t>
+        <w:br/>
+      </w:r>
+      <w:r>
+        <w:rPr>
+          <w:rFonts w:ascii="Consolas" w:hAnsi="Consolas"/>
+          <w:color w:val="332A22"/>
+          <w:sz w:val="19"/>
+        </w:rPr>
+        <w:br/>
+      </w:r>
+      <w:r>
+        <w:rPr>
+          <w:rFonts w:ascii="Consolas" w:hAnsi="Consolas"/>
+          <w:color w:val="332A22"/>
+          <w:sz w:val="19"/>
+        </w:rPr>
+        <w:t>1. Segurado pede restabelecimento de auxílio-doença cessado</w:t>
+        <w:br/>
+      </w:r>
+      <w:r>
+        <w:rPr>
+          <w:rFonts w:ascii="Consolas" w:hAnsi="Consolas"/>
+          <w:color w:val="332A22"/>
+          <w:sz w:val="19"/>
+        </w:rPr>
+        <w:t>2. Execução fiscal de valor baixo, devedor ainda não citado</w:t>
+        <w:br/>
+      </w:r>
+      <w:r>
+        <w:rPr>
+          <w:rFonts w:ascii="Consolas" w:hAnsi="Consolas"/>
+          <w:color w:val="332A22"/>
+          <w:sz w:val="19"/>
+        </w:rPr>
+        <w:t>3. Mandado de segurança com pedido de liminar</w:t>
+        <w:br/>
+      </w:r>
+      <w:r>
+        <w:rPr>
+          <w:rFonts w:ascii="Consolas" w:hAnsi="Consolas"/>
+          <w:color w:val="332A22"/>
+          <w:sz w:val="19"/>
+        </w:rPr>
+        <w:t>4. Pedido de gratuidade de justiça em ação de indenização</w:t>
+        <w:br/>
+      </w:r>
+      <w:r>
+        <w:rPr>
+          <w:rFonts w:ascii="Consolas" w:hAnsi="Consolas"/>
+          <w:color w:val="332A22"/>
+          <w:sz w:val="19"/>
+        </w:rPr>
+        <w:t>5. Habeas corpus, réu preso, alegação de excesso de prazo</w:t>
+        <w:br/>
+      </w:r>
+      <w:r>
+        <w:rPr>
+          <w:rFonts w:ascii="Consolas" w:hAnsi="Consolas"/>
+          <w:color w:val="332A22"/>
+          <w:sz w:val="19"/>
+        </w:rPr>
+        <w:t>6. Cumprimento de sentença com cálculo divergente</w:t>
+      </w:r>
+    </w:p>
+    <w:p>
+      <w:pPr>
+        <w:spacing w:before="160" w:after="40"/>
+      </w:pPr>
+      <w:r>
+        <w:rPr>
+          <w:b/>
+          <w:color w:val="C85A1B"/>
+          <w:sz w:val="23"/>
+        </w:rPr>
+        <w:t>O que destacar</w:t>
+      </w:r>
+    </w:p>
+    <w:p>
+      <w:pPr>
+        <w:pStyle w:val="ListBullet"/>
+      </w:pPr>
+      <w:r>
+        <w:rPr>
+          <w:color w:val="444B55"/>
+        </w:rPr>
+        <w:t>A resposta vem em tabela pronta, classificada e justificada.</w:t>
+      </w:r>
+    </w:p>
+    <w:p>
+      <w:pPr>
+        <w:pStyle w:val="ListBullet"/>
+      </w:pPr>
+      <w:r>
+        <w:rPr>
+          <w:color w:val="444B55"/>
+        </w:rPr>
+        <w:t>O item 5 (habeas corpus, réu preso) salta como alta urgência: é o valor da triagem.</w:t>
+      </w:r>
+    </w:p>
+    <w:p>
+      <w:pPr>
+        <w:pStyle w:val="ListBullet"/>
+      </w:pPr>
+      <w:r>
+        <w:rPr>
+          <w:color w:val="444B55"/>
+        </w:rPr>
+        <w:t>Os itens marcados como "revisar" são decididos por um servidor, nunca pela ferramenta.</w:t>
+      </w:r>
+    </w:p>
+    <w:p>
+      <w:pPr>
+        <w:spacing w:before="160" w:after="40"/>
+      </w:pPr>
+      <w:r>
+        <w:rPr>
+          <w:b/>
+          <w:color w:val="222833"/>
+          <w:sz w:val="23"/>
+        </w:rPr>
+        <w:t>Antes de confiar na resposta</w:t>
+      </w:r>
+    </w:p>
+    <w:p>
+      <w:pPr>
+        <w:spacing w:after="40"/>
+      </w:pPr>
+      <w:r>
+        <w:rPr>
+          <w:b/>
+          <w:color w:val="C85A1B"/>
+        </w:rPr>
+        <w:t xml:space="preserve">☐  </w:t>
+      </w:r>
+      <w:r>
+        <w:rPr>
+          <w:color w:val="444B55"/>
+        </w:rPr>
+        <w:t>A classificação reflete a regra de trabalho da unidade?</w:t>
+      </w:r>
+    </w:p>
+    <w:p>
+      <w:pPr>
+        <w:spacing w:after="40"/>
+      </w:pPr>
+      <w:r>
+        <w:rPr>
+          <w:b/>
+          <w:color w:val="C85A1B"/>
+        </w:rPr>
+        <w:t xml:space="preserve">☐  </w:t>
+      </w:r>
+      <w:r>
+        <w:rPr>
+          <w:color w:val="444B55"/>
+        </w:rPr>
+        <w:t>Os "revisar" foram decididos por um humano?</w:t>
+      </w:r>
+    </w:p>
+    <w:p>
+      <w:pPr>
+        <w:spacing w:before="240" w:after="40"/>
+      </w:pPr>
+      <w:r>
+        <w:rPr>
+          <w:b/>
+          <w:color w:val="222833"/>
+          <w:sz w:val="28"/>
+        </w:rPr>
+        <w:t>E2 · Modelos e trabalho em lote</w:t>
+      </w:r>
+    </w:p>
+    <w:p>
+      <w:r>
+        <w:rPr>
+          <w:i/>
+          <w:color w:val="6B7280"/>
+          <w:sz w:val="21"/>
+        </w:rPr>
+        <w:t>Objetivo: gerar vários documentos de uma vez a partir de uma tabela e um modelo reutilizável. (Módulo 3, aula de Modelos e trabalho em lote.)</w:t>
+      </w:r>
+    </w:p>
+    <w:p>
+      <w:pPr>
+        <w:spacing w:before="160" w:after="40"/>
+      </w:pPr>
+      <w:r>
+        <w:rPr>
+          <w:b/>
+          <w:color w:val="C85A1B"/>
+          <w:sz w:val="23"/>
+        </w:rPr>
+        <w:t>Cole na ferramenta de IA</w:t>
+      </w:r>
+    </w:p>
+    <w:p>
+      <w:pPr>
+        <w:spacing w:before="80" w:after="160" w:line="278" w:lineRule="auto"/>
+        <w:shd w:val="clear" w:fill="F4F1EC"/>
+        <w:pBdr>
+          <w:top w:val="single" w:sz="6" w:space="8" w:color="D9CFC0"/>
+          <w:left w:val="single" w:sz="6" w:space="8" w:color="D9CFC0"/>
+          <w:bottom w:val="single" w:sz="6" w:space="8" w:color="D9CFC0"/>
+          <w:right w:val="single" w:sz="6" w:space="8" w:color="D9CFC0"/>
+        </w:pBdr>
+      </w:pPr>
+      <w:r>
+        <w:rPr>
+          <w:rFonts w:ascii="Consolas" w:hAnsi="Consolas"/>
+          <w:color w:val="332A22"/>
+          <w:sz w:val="19"/>
+        </w:rPr>
+        <w:t>Você redige comunicações para a [unidade] da Justiça Federal no Ceará.</w:t>
+        <w:br/>
+      </w:r>
+      <w:r>
+        <w:rPr>
+          <w:rFonts w:ascii="Consolas" w:hAnsi="Consolas"/>
+          <w:color w:val="332A22"/>
+          <w:sz w:val="19"/>
+        </w:rPr>
+        <w:t>Use o MODELO e a TABELA abaixo para gerar uma intimação para cada linha, já preenchida.</w:t>
+        <w:br/>
+      </w:r>
+      <w:r>
+        <w:rPr>
+          <w:rFonts w:ascii="Consolas" w:hAnsi="Consolas"/>
+          <w:color w:val="332A22"/>
+          <w:sz w:val="19"/>
+        </w:rPr>
+        <w:t>Mantenha o texto idêntico, trocando apenas os campos.</w:t>
+        <w:br/>
+      </w:r>
+      <w:r>
+        <w:rPr>
+          <w:rFonts w:ascii="Consolas" w:hAnsi="Consolas"/>
+          <w:color w:val="332A22"/>
+          <w:sz w:val="19"/>
+        </w:rPr>
+        <w:br/>
+      </w:r>
+      <w:r>
+        <w:rPr>
+          <w:rFonts w:ascii="Consolas" w:hAnsi="Consolas"/>
+          <w:color w:val="332A22"/>
+          <w:sz w:val="19"/>
+        </w:rPr>
+        <w:t>MODELO:</w:t>
+        <w:br/>
+      </w:r>
+      <w:r>
+        <w:rPr>
+          <w:rFonts w:ascii="Consolas" w:hAnsi="Consolas"/>
+          <w:color w:val="332A22"/>
+          <w:sz w:val="19"/>
+        </w:rPr>
+        <w:t>"Fica V. Sa. intimado(a), no processo [PROCESSO], a [PROVIDÊNCIA], no prazo de [PRAZO]."</w:t>
+        <w:br/>
+      </w:r>
+      <w:r>
+        <w:rPr>
+          <w:rFonts w:ascii="Consolas" w:hAnsi="Consolas"/>
+          <w:color w:val="332A22"/>
+          <w:sz w:val="19"/>
+        </w:rPr>
+        <w:br/>
+      </w:r>
+      <w:r>
+        <w:rPr>
+          <w:rFonts w:ascii="Consolas" w:hAnsi="Consolas"/>
+          <w:color w:val="332A22"/>
+          <w:sz w:val="19"/>
+        </w:rPr>
+        <w:t>TABELA (dados fictícios/anonimizados):</w:t>
+        <w:br/>
+      </w:r>
+      <w:r>
+        <w:rPr>
+          <w:rFonts w:ascii="Consolas" w:hAnsi="Consolas"/>
+          <w:color w:val="332A22"/>
+          <w:sz w:val="19"/>
+        </w:rPr>
+        <w:t>[PARTE A] | proc 0001 | apresentar contrarrazões | 15 dias</w:t>
+        <w:br/>
+      </w:r>
+      <w:r>
+        <w:rPr>
+          <w:rFonts w:ascii="Consolas" w:hAnsi="Consolas"/>
+          <w:color w:val="332A22"/>
+          <w:sz w:val="19"/>
+        </w:rPr>
+        <w:t>[PARTE B] | proc 0002 | manifestar sobre o laudo | 10 dias</w:t>
+        <w:br/>
+      </w:r>
+      <w:r>
+        <w:rPr>
+          <w:rFonts w:ascii="Consolas" w:hAnsi="Consolas"/>
+          <w:color w:val="332A22"/>
+          <w:sz w:val="19"/>
+        </w:rPr>
+        <w:t>[PARTE C] | proc 0003 | regularizar a representação | 5 dias</w:t>
+        <w:br/>
+      </w:r>
+      <w:r>
+        <w:rPr>
+          <w:rFonts w:ascii="Consolas" w:hAnsi="Consolas"/>
+          <w:color w:val="332A22"/>
+          <w:sz w:val="19"/>
+        </w:rPr>
+        <w:t>[PARTE D] | proc 0004 | recolher as custas | 15 dias</w:t>
+      </w:r>
+    </w:p>
+    <w:p>
+      <w:pPr>
+        <w:spacing w:before="160" w:after="40"/>
+      </w:pPr>
+      <w:r>
+        <w:rPr>
+          <w:b/>
+          <w:color w:val="C85A1B"/>
+          <w:sz w:val="23"/>
+        </w:rPr>
+        <w:t>O que destacar</w:t>
+      </w:r>
+    </w:p>
+    <w:p>
+      <w:pPr>
+        <w:pStyle w:val="ListBullet"/>
+      </w:pPr>
+      <w:r>
+        <w:rPr>
+          <w:color w:val="444B55"/>
+        </w:rPr>
+        <w:t>As quatro intimações saem de uma vez, já preenchidas.</w:t>
+      </w:r>
+    </w:p>
+    <w:p>
+      <w:pPr>
+        <w:pStyle w:val="ListBullet"/>
+      </w:pPr>
+      <w:r>
+        <w:rPr>
+          <w:color w:val="444B55"/>
+        </w:rPr>
+        <w:t>O mesmo modelo serve para a semana seguinte: é só trocar a tabela.</w:t>
+      </w:r>
+    </w:p>
+    <w:p>
+      <w:pPr>
+        <w:pStyle w:val="ListBullet"/>
+      </w:pPr>
+      <w:r>
+        <w:rPr>
+          <w:color w:val="444B55"/>
+        </w:rPr>
+        <w:t>Antes de usar com dados reais, anonimize ou use ferramenta homologada (LGPD e sigilo).</w:t>
+      </w:r>
+    </w:p>
+    <w:p>
+      <w:pPr>
+        <w:spacing w:before="160" w:after="40"/>
+      </w:pPr>
+      <w:r>
+        <w:rPr>
+          <w:b/>
+          <w:color w:val="222833"/>
+          <w:sz w:val="23"/>
+        </w:rPr>
+        <w:t>Antes de confiar na resposta</w:t>
+      </w:r>
+    </w:p>
+    <w:p>
+      <w:pPr>
+        <w:spacing w:after="40"/>
+      </w:pPr>
+      <w:r>
+        <w:rPr>
+          <w:b/>
+          <w:color w:val="C85A1B"/>
+        </w:rPr>
+        <w:t xml:space="preserve">☐  </w:t>
+      </w:r>
+      <w:r>
+        <w:rPr>
+          <w:color w:val="444B55"/>
+        </w:rPr>
+        <w:t>Cada documento foi conferido antes de assinar ou expedir?</w:t>
+      </w:r>
+    </w:p>
+    <w:p>
+      <w:pPr>
+        <w:spacing w:after="40"/>
+      </w:pPr>
+      <w:r>
+        <w:rPr>
+          <w:b/>
+          <w:color w:val="C85A1B"/>
+        </w:rPr>
+        <w:t xml:space="preserve">☐  </w:t>
+      </w:r>
+      <w:r>
+        <w:rPr>
+          <w:color w:val="444B55"/>
+        </w:rPr>
+        <w:t>Nenhum dado pessoal real foi colado em ferramenta externa?</w:t>
       </w:r>
     </w:p>
     <w:p>
@@ -5415,7 +5933,7 @@
               <w:rPr>
                 <w:sz w:val="21"/>
               </w:rPr>
-              <w:t>24h em 4 módulos (Fundamentos 6h · Prática 10h · Pensamento crítico 6h · Ética/LGPD 2h)</w:t>
+              <w:t>24h em 4 módulos (Fundamentos 6h · Pensamento crítico 6h · Prática 10h · Ética/LGPD 2h)</w:t>
             </w:r>
           </w:p>
         </w:tc>

</xml_diff>

<commit_message>
Banco: corrige títulos dos apêndices (numeração nova + remove 'administrativa')
Co-Authored-By: Claude Opus 4.8 (1M context) <noreply@anthropic.com>
</commit_message>
<xml_diff>
--- a/Banco-de-Prompts-Servidor-IA.docx
+++ b/Banco-de-Prompts-Servidor-IA.docx
@@ -3868,7 +3868,7 @@
           <w:color w:val="222833"/>
           <w:sz w:val="28"/>
         </w:rPr>
-        <w:t>Apêndice A · Prática forense e administrativa (Módulo 2)</w:t>
+        <w:t>Apêndice A · Prática forense (Módulo 3)</w:t>
       </w:r>
     </w:p>
     <w:p>
@@ -3973,7 +3973,7 @@
           <w:color w:val="222833"/>
           <w:sz w:val="28"/>
         </w:rPr>
-        <w:t>Apêndice B · Pensamento crítico e causal (Módulo 3)</w:t>
+        <w:t>Apêndice B · Pensamento crítico e causal (Módulo 2)</w:t>
       </w:r>
     </w:p>
     <w:p>

</xml_diff>